<commit_message>
Added results of testing task 8.2
</commit_message>
<xml_diff>
--- a/lab08/TestSuite/TS-8_2.docx
+++ b/lab08/TestSuite/TS-8_2.docx
@@ -846,7 +846,19 @@
             <w:shd w:val="clear" w:color="auto" w:fill="auto"/>
             <w:vAlign w:val="center"/>
           </w:tcPr>
-          <w:p/>
+          <w:p>
+            <w:pPr>
+              <w:rPr>
+                <w:lang w:val="en-US"/>
+              </w:rPr>
+            </w:pPr>
+            <w:r>
+              <w:rPr>
+                <w:lang w:val="en-US"/>
+              </w:rPr>
+              <w:t>passed</w:t>
+            </w:r>
+          </w:p>
         </w:tc>
       </w:tr>
       <w:tr>
@@ -916,7 +928,14 @@
             <w:shd w:val="clear" w:color="auto" w:fill="auto"/>
             <w:vAlign w:val="center"/>
           </w:tcPr>
-          <w:p/>
+          <w:p>
+            <w:r>
+              <w:rPr>
+                <w:lang w:val="en-US"/>
+              </w:rPr>
+              <w:t>passed</w:t>
+            </w:r>
+          </w:p>
         </w:tc>
       </w:tr>
       <w:tr>
@@ -986,7 +1005,14 @@
             <w:shd w:val="clear" w:color="auto" w:fill="auto"/>
             <w:vAlign w:val="center"/>
           </w:tcPr>
-          <w:p/>
+          <w:p>
+            <w:r>
+              <w:rPr>
+                <w:lang w:val="en-US"/>
+              </w:rPr>
+              <w:t>passed</w:t>
+            </w:r>
+          </w:p>
         </w:tc>
       </w:tr>
       <w:tr>
@@ -1052,7 +1078,14 @@
             <w:shd w:val="clear" w:color="auto" w:fill="auto"/>
             <w:vAlign w:val="center"/>
           </w:tcPr>
-          <w:p/>
+          <w:p>
+            <w:r>
+              <w:rPr>
+                <w:lang w:val="en-US"/>
+              </w:rPr>
+              <w:t>passed</w:t>
+            </w:r>
+          </w:p>
         </w:tc>
       </w:tr>
       <w:tr>
@@ -1122,7 +1155,14 @@
             <w:shd w:val="clear" w:color="auto" w:fill="auto"/>
             <w:vAlign w:val="center"/>
           </w:tcPr>
-          <w:p/>
+          <w:p>
+            <w:r>
+              <w:rPr>
+                <w:lang w:val="en-US"/>
+              </w:rPr>
+              <w:t>passed</w:t>
+            </w:r>
+          </w:p>
         </w:tc>
       </w:tr>
     </w:tbl>
@@ -1279,7 +1319,7 @@
               <w:sz w:val="16"/>
               <w:szCs w:val="16"/>
             </w:rPr>
-            <w:t>12:15:46</w:t>
+            <w:t>12:21:53</w:t>
           </w:r>
           <w:r>
             <w:rPr>
@@ -1550,7 +1590,7 @@
               <w:sz w:val="16"/>
               <w:szCs w:val="16"/>
             </w:rPr>
-            <w:t>12:15:46</w:t>
+            <w:t>12:21:53</w:t>
           </w:r>
           <w:r>
             <w:rPr>

</xml_diff>